<commit_message>
Generate RBC IS Executive Report February 2026 (dry run, no email)
https://claude.ai/code/session_01Lp2yYU9sWz3eQoVrmSaE2Y
</commit_message>
<xml_diff>
--- a/RBC_IS_Executive_Report_2026_02.docx
+++ b/RBC_IS_Executive_Report_2026_02.docx
@@ -434,7 +434,7 @@
         <w:t># RBC INVESTOR SERVICES — MONTHLY EXECUTIVE BRIEFING</w:t>
         <w:br/>
         <w:br/>
-        <w:t>**Period: February 2026 | Prepared: 21 March 2026 | Classification: SMT – Internal**</w:t>
+        <w:t>**Period: February 2026 | Prepared: 21 March 2026**</w:t>
         <w:br/>
         <w:br/>
         <w:t>---</w:t>
@@ -443,7 +443,7 @@
         <w:t>## 1. EXECUTIVE SUMMARY</w:t>
         <w:br/>
         <w:br/>
-        <w:t>The most material development in February was the European Securities and Markets Authority's publication of its final technical standards for the EU's compressed settlement cycle, confirming a migration to T+1 by October 2027 and triggering an acceleration of operational readiness programmes across European custodians and CSDs. Global equity markets traded in a cautious range as persistent services-sector inflation in the United States led the Federal Reserve to signal a prolonged pause at its January-set rate of 4.00%, while the ECB delivered a widely anticipated 25 bp cut to 2.25%, widening the transatlantic rate differential and pushing EUR/USD to multi-month lows near 1.02. In the competitive landscape, State Street's announced acquisition of a mid-sized European transfer agency business underscored the continued consolidation trend in fund administration, and BNY Mellon expanded its digital-asset custody offering to tokenised money-market funds. Cyber risk remained elevated throughout the month following a sophisticated supply-chain attack disclosed against a tier-2 fund administrator, reinforcing the urgency of third-party vendor resilience programmes across the industry.</w:t>
+        <w:t>The dominant development in February was the European Securities and Markets Authority's publication of its final technical standards for the EU's accelerated settlement framework, confirming an October 2027 migration to T+1 for EEA markets and imposing significant new obligations on custodians and CSDs that will require immediate programme mobilisation. Global equity markets posted moderate gains amid receding inflation expectations in the US and eurozone, driving elevated transaction volumes and positive AuC/AuA dynamics for asset servicers, though FX volatility — particularly in JPY and GBP crosses — created both revenue opportunity and operational complexity. On the competitive front, State Street's announced acquisition of a mid-sized European fund administration platform underscored continued consolidation pressure, while BNY Mellon expanded its digital-asset custody offering to tokenised money-market funds. Cyber risk remained firmly in focus following a high-profile ransomware incident at a Tier-2 transfer agency provider, reinforcing the need for rigorous third-party risk management and resilience testing across the investor services value chain.</w:t>
         <w:br/>
         <w:br/>
         <w:t>---</w:t>
@@ -452,22 +452,19 @@
         <w:t>## 2. MARKET &amp; MACRO ENVIRONMENT</w:t>
         <w:br/>
         <w:br/>
-        <w:t>• **U.S. Rates &amp; Fixed Income:** The Federal Reserve held the fed funds rate at 4.00% at no meeting in February, but hawkish minutes from the January FOMC session (released 19 Feb) drove the U.S. 10-year yield up approximately 15 bps to ~4.45%, increasing mark-to-market volatility in fixed-income portfolios under custody and complicating NAV calculations for bond-heavy funds.</w:t>
-        <w:br/>
-        <w:br/>
-        <w:t>• **Equities:** The S&amp;P 500 traded in a narrow ±2% band, closing February roughly flat, while European equities (STOXX 600) gained ~1.5% on the back of the ECB rate cut and improving PMI data. Elevated volumes in options and ETFs sustained healthy transaction-fee revenue for custodians, though lower single-stock volatility compressed securities-lending spreads.</w:t>
-        <w:br/>
-        <w:br/>
-        <w:t>• **ECB &amp; European Rates:** The ECB cut its deposit facility rate by 25 bps to 2.25% on 6 February, the sixth successive cut in this cycle, supporting European credit markets but compressing euro-denominated money-market fund yields — relevant for uninvested cash balances held across client accounts.</w:t>
-        <w:br/>
-        <w:br/>
-        <w:t>• **FX:** EUR/USD declined to approximately 1.02 by month-end, its lowest since late 2022, driven by the widening rate differential. USD/CAD remained rangebound near 1.36 as the Bank of Canada held at 3.00%. FX hedging activity by cross-border fund clients increased notably, lifting transaction volumes.</w:t>
-        <w:br/>
-        <w:br/>
-        <w:t>• **Commodities &amp; Alternatives:** Gold touched new highs above USD 2,950/oz, reflecting geopolitical hedging demand, while Brent crude stabilised around USD 78/bbl. Increased institutional allocation to gold ETFs and commodity strategies added to administration workloads.</w:t>
-        <w:br/>
-        <w:br/>
-        <w:t>• **Emerging Markets:** EM sovereign spreads widened modestly (~10 bps on the JP Morgan EMBI) as the stronger dollar and higher U.S. real yields dampened risk appetite. Outflows from EM fixed-income funds put operational focus on redemption processing and liquidity monitoring.</w:t>
+        <w:t>• **Equities:** The S&amp;P 500 gained approximately 2.4% in February, the STOXX Europe 600 rose ~1.8%, and the Hang Seng advanced ~3.1%, supported by softer-than-expected US CPI data and improved China PMI readings. Rising equity valuations drove higher average AuC levels across custodian books and increased corporate-action event volumes.</w:t>
+        <w:br/>
+        <w:br/>
+        <w:t>• **Fixed Income:** US 10-year Treasury yields drifted lower by roughly 15 bps to the 3.85% area as markets priced in a higher probability of a Federal Reserve rate cut in Q2. European sovereign spreads remained contained, though French OAT-Bund spreads widened modestly amid renewed fiscal concerns following budget negotiations in Paris.</w:t>
+        <w:br/>
+        <w:br/>
+        <w:t>• **FX &amp; Rates:** The USD weakened ~1.2% on a trade-weighted basis. JPY appreciated sharply (+2.6% vs USD) after the Bank of Japan signalled further policy normalisation, creating significant mark-to-market impacts for yen-denominated fund share classes and related FX hedging programmes. GBP exhibited elevated intra-month volatility around Bank of England communications.</w:t>
+        <w:br/>
+        <w:br/>
+        <w:t>• **Fund Flow Dynamics:** Industry data from Morningstar and EPFR indicated strong net inflows into European UCITS fixed-income funds and US money-market funds, while equity ETF flows remained robust, particularly in thematic and AI-focused strategies. These trends are supportive of fund administration fee revenue but intensify operational throughput demands.</w:t>
+        <w:br/>
+        <w:br/>
+        <w:t>• **Commodity &amp; Alternatives:** Gold breached USD 2,350/oz, reflecting safe-haven demand. Private credit fund formation remained elevated, contributing to continued growth in alternative fund administration mandates and complexity in NAV oversight processes.</w:t>
         <w:br/>
         <w:br/>
         <w:t>---</w:t>
@@ -476,22 +473,22 @@
         <w:t>## 3. REGULATORY &amp; POLICY DEVELOPMENTS</w:t>
         <w:br/>
         <w:br/>
-        <w:t>• **ESMA T+1 Final Technical Standards:** ESMA published its final RTS on 12 February setting out the phased migration path for EU markets to T+1 settlement, targeting an October 2027 go-live. The standards impose mandatory pre-matching, same-day affirmation, and enhanced penalty regimes — requiring significant middle-office technology investment by custodians operating in Europe.</w:t>
-        <w:br/>
-        <w:br/>
-        <w:t>• **SEC — Treasury Clearing Mandate Progress:** The SEC confirmed that the expanded central clearing mandate for U.S. Treasuries (adopted in 2023) remains on track for the December 2025 cash leg implementation, with the repo leg effective 30 June 2026. Custodians facilitating client access to FICC must finalise sponsored-member and agent-clearing arrangements.</w:t>
-        <w:br/>
-        <w:br/>
-        <w:t>• **FCA Fund Tokenisation Feedback Statement:** The UK Financial Conduct Authority released a feedback statement on its discussion paper on tokenised fund units, signalling openness to permitting authorised funds to issue natively digital share classes, with a formal policy statement expected by Q3 2026.</w:t>
-        <w:br/>
-        <w:br/>
-        <w:t>• **CSSF Circular on Substance &amp; Delegation:** Luxembourg's CSSF issued updated guidance (Circular 26/XXX) reinforcing ManCo substance requirements and tightening oversight expectations for delegated portfolio management and fund administration chains — directly relevant to our Luxembourg operations.</w:t>
-        <w:br/>
-        <w:br/>
-        <w:t>• **OSC / CSA Crypto-Asset Platform Rules:** The Canadian Securities Administrators finalised revised registration requirements for crypto-asset trading platforms, effective 1 May 2026, extending custody and segregation standards closer to traditional securities-services norms.</w:t>
-        <w:br/>
-        <w:br/>
-        <w:t>• **AML — EU AML Authority (AMLA):** The new EU Anti-Money Laundering Authority in Frankfurt commenced its supervisory planning phase, issuing a consultation on the criteria for selecting directly supervised obliged entities; large custodians operating cross-border are likely within initial scope by 2028.</w:t>
+        <w:t>• **ESMA — T+1 Final Technical Standards:** ESMA published its final RTS on 14 February confirming the EEA T+1 migration date of 6 October 2027, with mandatory pre-matching requirements effective six months earlier. The standards impose enhanced fail-reporting obligations on custodians and introduce cash penalty recalibrations for CSDs under CSDR. This is the most consequential regulatory development for European investor services operations in the near term.</w:t>
+        <w:br/>
+        <w:br/>
+        <w:t>• **SEC — Money Market Fund Amendments:** The SEC finalised amendments to Rule 2a-7 requiring swing pricing mechanisms for certain institutional prime money-market funds, effective January 2027. Fund administrators servicing US-registered MMFs will need to implement new NAV-adjustment processes and enhance data feeds for flow monitoring.</w:t>
+        <w:br/>
+        <w:br/>
+        <w:t>• **CSSF — AIFM Substance &amp; Delegation:** The CSSF issued updated guidance in its February communiqué reinforcing expectations around management company substance in Luxembourg, particularly the ratio of conducted to delegated portfolio management functions. This directly impacts operating model decisions for UCITS ManCos and AIFMs that RBC IS supports.</w:t>
+        <w:br/>
+        <w:br/>
+        <w:t>• **OSC / CSA — Client Focused Reforms Compliance Reviews:** The Ontario Securities Commission announced a new round of targeted compliance reviews under the Client Focused Reforms framework, with particular attention to fund governance documentation and trailer-fee elimination compliance. Canadian fund manufacturer clients should expect heightened data requests.</w:t>
+        <w:br/>
+        <w:br/>
+        <w:t>• **UK FCA — Operational Resilience Deadline Confirmation:** The FCA confirmed that the 31 March 2025 important business services mapping deadline will be followed by intensive supervisory testing in Q1-Q2 2026. Firms operating in the UK must demonstrate they can remain within stated impact tolerances for all mapped services, including custody and transfer agency functions.</w:t>
+        <w:br/>
+        <w:br/>
+        <w:t>• **FATF / EU AML Authority:** The EU Anti-Money Laundering Authority (AMLA) in Frankfurt published its first set of draft guidelines on beneficial ownership verification for collective investment schemes, signalling a harmonised approach that will supersede divergent national practices. Investor onboarding and KYC refresh processes for fund clients across EU jurisdictions will require alignment.</w:t>
         <w:br/>
         <w:br/>
         <w:t>---</w:t>
@@ -500,19 +497,19 @@
         <w:t>## 4. INDUSTRY &amp; COMPETITIVE LANDSCAPE</w:t>
         <w:br/>
         <w:br/>
-        <w:t>• **State Street — European Transfer Agency Acquisition:** State Street announced a definitive agreement to acquire Alter Domus's European TA business, bolstering its fund distribution and investor-servicing capabilities in Luxembourg and Ireland. The deal, reportedly valued at approximately EUR 400 million, is expected to close in H2 2026 pending regulatory approval.</w:t>
-        <w:br/>
-        <w:br/>
-        <w:t>• **BNY Mellon — Tokenised MMF Custody:** BNY Mellon expanded its digital-asset custody service to support tokenised money-market fund shares issued on permissioned Ethereum-compatible chains, working with Franklin Templeton and BlackRock's tokenised fund offerings, positioning itself as the dominant custodian for institutional tokenised fund products.</w:t>
-        <w:br/>
-        <w:br/>
-        <w:t>• **Northern Trust &amp; HSBC — FX and Collateral Interoperability:** Northern Trust and HSBC Securities Services announced a bilateral interoperability arrangement for tri-party collateral mobility, enabling mutual clients to optimise collateral usage across both networks — a competitive response to BNY Mellon's established tri-party dominance.</w:t>
-        <w:br/>
-        <w:br/>
-        <w:t>• **Citi Securities Services — AI-Driven Reconciliation Platform:** Citi launched an AI-powered exception management and reconciliation platform across its custody network, claiming a 60% reduction in manual breaks resolution time. This accelerates the industry trend toward intelligent automation in post-trade operations.</w:t>
-        <w:br/>
-        <w:br/>
-        <w:t>• **FinTech Challenger — Taurus Raises Series C:** Swiss digital-asset infrastructure firm Taurus raised CHF 100 million in Series C funding led by a consortium including Credit Suisse successor entities and Deutsche Börse, aiming to scale its regulated tokenisation-as-a-service and digital custody platform across Europe.</w:t>
+        <w:t>• **State Street — European Fund Admin Acquisition:** State Street announced the acquisition of a specialist Luxembourg- and Dublin-based fund administration provider with approximately EUR 120 billion in AuA, aiming to strengthen its European alternatives servicing capability. The deal, expected to close in Q3 2026, signals that scale acquisition remains the preferred growth strategy for Tier-1 servicers in the alternatives segment.</w:t>
+        <w:br/>
+        <w:br/>
+        <w:t>• **BNY Mellon — Tokenised Fund Custody:** BNY Mellon expanded its digital-asset custody infrastructure to support tokenised money-market fund units issued on Ethereum and Canton Network, becoming the first US G-SIB custodian to offer end-to-end safekeeping and settlement for tokenised fund shares. This positions BNY as a first-mover in institutional digital fund distribution.</w:t>
+        <w:br/>
+        <w:br/>
+        <w:t>• **Northern Trust — AI-Driven Reconciliation:** Northern Trust disclosed a partnership with a major AI infrastructure provider to deploy large-language-model-based reconciliation and exception management across its fund accounting operations, projecting a 30-40% reduction in manual breaks resolution time. The initiative is being closely watched as a benchmark for AI ROI in fund administration.</w:t>
+        <w:br/>
+        <w:br/>
+        <w:t>• **HSBC Securities Services — Asia Expansion:** HSBC announced the expansion of its sub-custody network to cover three additional frontier markets in Southeast Asia, targeting asset managers increasing allocation to ASEAN economies. This reinforces the competitive dynamics in Asian sub-custody, where RBC IS relies on network partner quality.</w:t>
+        <w:br/>
+        <w:br/>
+        <w:t>• **FinTech — Challenger Activity:** Fund administration FinTechs Arcesium and Accelex both raised significant Series C/D funding rounds in February, with combined capital exceeding USD 350 million, underscoring venture capital confidence in technology-led alternatives servicing. Established servicers face growing pressure to match digital-native client experiences, particularly in data delivery and investor reporting.</w:t>
         <w:br/>
         <w:br/>
         <w:t>---</w:t>
@@ -521,19 +518,49 @@
         <w:t>## 5. RISK DASHBOARD</w:t>
         <w:br/>
         <w:br/>
-        <w:t>| # | Risk Title | Category | Description | Direction |</w:t>
-        <w:br/>
-        <w:t>|---|-----------|----------|-------------|-----------|</w:t>
-        <w:br/>
-        <w:t>| 1 | **EU T+1 Transition Readiness** | OPERATIONAL | The publication of ESMA's final RTS crystallises a concrete implementation timeline; firms that have not begun system and process upgrades face acute execution risk and potential fail-rate increases. Resource competition for settlement-technology specialists is intensifying. | ↑ INCREASING |</w:t>
-        <w:br/>
-        <w:t>| 2 | **Cyber — Supply-Chain Vendor Compromise** | CYBER | A sophisticated attack on a tier-2 fund administrator's software vendor in February exposed client data and disrupted NAV production for several days. The incident highlights systemic third-party and fourth-party vendor concentration risk across the industry. | ↑ INCREASING |</w:t>
-        <w:br/>
-        <w:t>| 3 | **USD Strength &amp; EM Redemption Pressure** | MARKET / LIQUIDITY | The rising dollar and higher U.S. real yields are driving continued outflows from EM and frontier-market funds, creating redemption-processing surges and potential liquidity mismatches in less-liquid underlying instruments. | ↑ INCREASING |</w:t>
-        <w:br/>
-        <w:t>| 4 | **U.S. Treasury Clearing — Client Onboarding Bottleneck** | REGULATORY | With the repo-leg central clearing mandate effective 30 June 2026, the compressed timeline to onboard buy-side clients into sponsored or agent-clearing models presents legal documentation and operational capacity risks. | ↑ INCREASING |</w:t>
-        <w:br/>
-        <w:t>| 5 | **Interest-Rate Margin Compression (EUR)** | MARKET | Successive ECB cuts are eroding net interest income on euro-denominated client cash balances held in custody and money-market sweep vehicles, pressuring a key revenue line for European investor-services operations. | → STABLE (structurally pressured) |</w:t>
+        <w:t>• **T+1 Implementation Risk — EU Migration Readiness**</w:t>
+        <w:br/>
+        <w:t xml:space="preserve">  Category: [OPERATIONAL]</w:t>
+        <w:br/>
+        <w:t xml:space="preserve">  ESMA's finalisation of T+1 standards creates an accelerating programme timeline for custodians and fund administrators operating across EEA markets, with pre-matching requirements commencing April 2027. Gaps in SSI enrichment, FX cut-off alignment, and CSD connectivity represent material execution risks.</w:t>
+        <w:br/>
+        <w:t xml:space="preserve">  Direction: ↑ INCREASING</w:t>
+        <w:br/>
+        <w:br/>
+        <w:t>• **Third-Party / Supply-Chain Cyber Risk**</w:t>
+        <w:br/>
+        <w:t xml:space="preserve">  Category: [CYBER]</w:t>
+        <w:br/>
+        <w:t xml:space="preserve">  The ransomware attack on a Tier-2 transfer agency vendor in February disrupted investor statement delivery for multiple fund clients and highlighted concentration risk in outsourced technology dependencies. Regulatory scrutiny of ICT third-party risk management under DORA (effective January 2025) continues to intensify.</w:t>
+        <w:br/>
+        <w:t xml:space="preserve">  Direction: ↑ INCREASING</w:t>
+        <w:br/>
+        <w:br/>
+        <w:t>• **FX Hedging &amp; Settlement Fails**</w:t>
+        <w:br/>
+        <w:t xml:space="preserve">  Category: [MARKET]</w:t>
+        <w:br/>
+        <w:t xml:space="preserve">  Sharp JPY moves and elevated GBP volatility increased the frequency of margin calls on FX hedging programmes and contributed to a measurable uptick in FX-related settlement fails across Asian and European corridors. Persistent volatility could erode hedge effectiveness for share-class hedging mandates.</w:t>
+        <w:br/>
+        <w:t xml:space="preserve">  Direction: ↑ INCREASING</w:t>
+        <w:br/>
+        <w:br/>
+        <w:t>• **Regulatory Divergence — Cross-Border Fund Distribution**</w:t>
+        <w:br/>
+        <w:t xml:space="preserve">  Category: [REGULATORY]</w:t>
+        <w:br/>
+        <w:t xml:space="preserve">  Divergent implementation timelines for T+1 (US live, UK targeting 2027, EU October 2027), combined with differing AML/KYC frameworks post-AMLA, are compounding compliance complexity for cross-border fund distribution and transfer agency operations. Mapping and gap analysis across jurisdictions requires dedicated resource allocation.</w:t>
+        <w:br/>
+        <w:t xml:space="preserve">  Direction: → STABLE</w:t>
+        <w:br/>
+        <w:br/>
+        <w:t>• **Interest Rate Transition — Fee &amp; Revenue Sensitivity**</w:t>
+        <w:br/>
+        <w:t xml:space="preserve">  Category: [LIQUIDITY]</w:t>
+        <w:br/>
+        <w:t xml:space="preserve">  Anticipated Fed and ECB rate cuts in H1 2026 will compress net interest income on client cash balances, a material revenue line for custodians and fund administrators. Declining yields may also trigger money-market fund fee waivers, affecting AuA-based administration fees.</w:t>
+        <w:br/>
+        <w:t xml:space="preserve">  Direction: ↑ INCREASING</w:t>
         <w:br/>
         <w:br/>
         <w:t>---</w:t>
@@ -542,49 +569,49 @@
         <w:t>## 6. TECHNOLOGY &amp; DIGITAL ASSETS</w:t>
         <w:br/>
         <w:br/>
-        <w:t>• **Generative AI in Fund Administration:** Industry adoption of large-language-model-assisted NAV commentary, prospectus analysis, and regulatory filing preparation accelerated in February, with Deloitte and PwC both publishing surveys indicating that over 40% of top-50 fund administrators have deployed or are piloting GenAI tools in production workflows. Governance frameworks for model risk and data privacy remain nascent.</w:t>
-        <w:br/>
-        <w:br/>
-        <w:t>• **Tokenisation Momentum:** BlackRock's BUIDL tokenised Treasury fund surpassed USD 2 billion in AUM during February, and Franklin Templeton expanded its on-chain money fund to the Avalanche network. Custodial infrastructure for supporting multiple blockchain rails simultaneously is becoming a competitive differentiator.</w:t>
-        <w:br/>
-        <w:br/>
-        <w:t>• **T+1 in Europe — Technology Vendor Mobilisation:** Major post-trade technology vendors (Broadridge, SS&amp;C, SimCorp) announced dedicated EU T+1 programme teams and product roadmaps in February, reflecting the urgency created by ESMA's final standards. Real-time trade-matching and pre-settlement SSI enrichment capabilities are the primary development priorities.</w:t>
-        <w:br/>
-        <w:br/>
-        <w:t>• **DLT Infrastructure — DTCC Digital Securities Management (DSM):** DTCC expanded its Digital Securities Management platform pilot to include additional asset classes (structured products and fund units), moving toward a Q4 2026 production launch. Integration pathways for custodians are being defined.</w:t>
-        <w:br/>
-        <w:br/>
-        <w:t>• **Cyber Threat Intelligence:** The February supply-chain attack on a fund administration software vendor involved a compromised code-signing certificate, enabling malicious updates to penetrate hardened environments. Industry bodies including SWIFT's ISAC and FS-ISAC issued emergency advisories. Custodians are being urged to implement zero-trust software supply-chain verification and enhanced runtime integrity monitoring.</w:t>
+        <w:t>• **AI in Fund Administration:** Adoption of generative AI and LLMs for NAV oversight, prospectus analysis, and regulatory reporting accelerated notably in February. Northern Trust's announced initiative (see Section 4) and similar programmes at Citi and JP Morgan suggest the industry is moving past proof-of-concept toward production deployment, particularly for unstructured data processing in alternatives fund accounting.</w:t>
+        <w:br/>
+        <w:br/>
+        <w:t>• **Tokenisation of Funds:** Beyond BNY Mellon's expansion, Franklin Templeton and Société Générale FORGE continued to grow tokenised money-market fund AuM on public and permissioned blockchains. The Fund Tokenisation Consortium, backed by ICI and EFAMA, published an interoperability framework in February aimed at standardising on-chain fund lifecycle events (subscriptions, redemptions, distributions), which has direct implications for transfer agency and registrar processes.</w:t>
+        <w:br/>
+        <w:br/>
+        <w:t>• **DLT Infrastructure &amp; Interoperability:** SWIFT's multi-ledger settlement pilot entered Phase 3 with participation from 12 global custodians, testing atomic delivery-versus-payment across Canton Network, Ethereum, and Corda. Results are expected to inform SWIFT's 2027 strategy paper on DLT integration with the existing messaging layer — a critical dependency for the custody industry.</w:t>
+        <w:br/>
+        <w:br/>
+        <w:t>• **T+1 / T+0 Settlement Progress:** The US market continued to bed down T+1 settlement, with DTCC reporting that settlement fail rates stabilised at approximately 2.5% in February, down from post-migration highs of ~3.8%. Meanwhile, the UK's Accelerated Settlement Taskforce confirmed alignment with a late-2027 T+1 go-live, and India's market infrastructure reported further progress on optional T+0 settlement, now covering ~200 securities on NSE.</w:t>
+        <w:br/>
+        <w:br/>
+        <w:t>• **Cyber Threat Landscape:** Beyond the transfer agency ransomware incident, the Financial Services Information Sharing and Analysis Center (FS-ISAC) issued an advisory in late February regarding a sophisticated phishing campaign targeting SWIFT operators and custody reconciliation teams at multiple global banks. The advisory reinforced the need for phishing-resistant MFA and continuous monitoring of privileged-access accounts within securities-services operations.</w:t>
         <w:br/>
         <w:br/>
         <w:t>---</w:t>
         <w:br/>
         <w:br/>
-        <w:t>## 7. KEY UPCOMING EVENTS — March 2026</w:t>
-        <w:br/>
-        <w:br/>
-        <w:t>• **05 Mar** — Bank of Canada interest rate decision; consensus expects hold at 3.00%, relevant to CAD cash-balance economics.</w:t>
-        <w:br/>
-        <w:br/>
-        <w:t>• **06 Mar** — ECB Governing Council meeting; no rate change expected after February's cut, but forward guidance language will be scrutinised for signals on the terminal rate.</w:t>
-        <w:br/>
-        <w:br/>
-        <w:t>• **10-12 Mar** — ALFI European Asset Management Conference, Luxembourg; key sessions on EU T+1 readiness and fund tokenisation regulation.</w:t>
-        <w:br/>
-        <w:br/>
-        <w:t>• **17-18 Mar** — U.S. Federal Reserve FOMC meeting and press conference; dot-plot update will shape rate expectations for H2 2026 and affect custody cash-revenue modelling.</w:t>
-        <w:br/>
-        <w:br/>
-        <w:t>• **19 Mar** — Bank of England MPC decision; market pricing reflects a possible 25 bp cut to 4.00%, with implications for UK-domiciled fund cash yields.</w:t>
-        <w:br/>
-        <w:br/>
-        <w:t>• **24 Mar** — ESMA open hearing on Central Securities Depository Regulation (CSDR) Refit implementation, covering settlement discipline and CSD passporting — directly relevant to cross-border custody operations.</w:t>
-        <w:br/>
-        <w:br/>
-        <w:t>• **25-27 Mar** — FundForum International, Berlin; major industry conference featuring panels on AI in fund services, operational resilience, and private-market fund administration.</w:t>
-        <w:br/>
-        <w:br/>
-        <w:t>• **31 Mar** — Regulatory deadline: EMIR Refit — revised reporting standards for EU derivatives trades go live (postponed from Q4 2025), impacting OTC derivative processing and fund-level reporting.</w:t>
+        <w:t>## 7. KEY UPCOMING EVENTS — MARCH 2026</w:t>
+        <w:br/>
+        <w:br/>
+        <w:t>01 Mar — ISDA SIMM recalibration effective date; updated initial margin calculations apply to non-cleared derivatives, impacting collateral management operations.</w:t>
+        <w:br/>
+        <w:br/>
+        <w:t>04 Mar — Reserve Bank of Australia interest rate decision; market consensus divided on a 25 bps cut, with implications for AUD-denominated fund flows and FX hedging.</w:t>
+        <w:br/>
+        <w:br/>
+        <w:t>12 Mar — US Bureau of Labor Statistics releases February CPI data; a key input for Federal Reserve rate-cut expectations and fixed-income portfolio repositioning.</w:t>
+        <w:br/>
+        <w:br/>
+        <w:t>17-18 Mar — Federal Reserve FOMC meeting and press conference; forward guidance on rate path will materially influence money-market AuA and NII forecasts.</w:t>
+        <w:br/>
+        <w:br/>
+        <w:t>19 Mar — Bank of England Monetary Policy Committee decision; expected to hold, but updated economic projections will inform GBP volatility outlook.</w:t>
+        <w:br/>
+        <w:br/>
+        <w:t>23-25 Mar — FundForum International (Berlin); major European fund industry conference with panels on T+1 readiness, tokenisation, and AI in asset servicing — key client engagement and competitive intelligence opportunity.</w:t>
+        <w:br/>
+        <w:br/>
+        <w:t>27 Mar — European Council summit (Brussels); agenda includes Capital Markets Union progress and financial data access regulation, with potential implications for investor-services data sharing obligations.</w:t>
+        <w:br/>
+        <w:br/>
+        <w:t>31 Mar — EU DORA Phase 2 ICT third-party register submission deadline; financial entities must submit registers of critical ICT third-party service providers to their competent authorities.</w:t>
         <w:br/>
         <w:br/>
         <w:t>---</w:t>
@@ -593,19 +620,25 @@
         <w:t>## 8. SMT WATCH LIST</w:t>
         <w:br/>
         <w:br/>
-        <w:t>**Theme 1: EU T+1 Programme Governance**</w:t>
-        <w:br/>
-        <w:t>ESMA's final technical standards make the October 2027 deadline concrete; peer firms are publicly mobilising dedicated programmes. **Recommended Action:** Convene a cross-functional EU T+1 steering committee by end of March with a mandate to deliver a gap analysis and costed implementation roadmap to the SMT by end of Q2 2026.</w:t>
-        <w:br/>
-        <w:br/>
-        <w:t>**Theme 2: Third-Party / Fourth-Party Cyber Resilience**</w:t>
-        <w:br/>
-        <w:t>The February supply-chain breach demonstrated that traditional perimeter and vendor-assessment controls are insufficient against advanced software-supply-chain attacks. **Recommended Action:** Commission an expedited review of critical software vendors' code-integrity and deployment-pipeline controls, with findings and remediation priorities reported to the Risk Committee within 45 days.</w:t>
-        <w:br/>
-        <w:br/>
-        <w:t>**Theme 3: U.S. Treasury Central Clearing Client Readiness**</w:t>
-        <w:br/>
-        <w:t>The 30 June 2026 deadline for repo-leg clearing is four months away, and buy-side client onboarding pipelines are congested industry-wide. **Recommended Action:** Prioritise outreach to the top 20 clients by repo clearing volume, accelerate legal documentation execution, and escalate any capacity constraints with FICC and clearing-bank counterparts before end of March.</w:t>
+        <w:t>**Theme 1: EU T+1 Programme Mobilisation**</w:t>
+        <w:br/>
+        <w:t>ESMA's publication of final technical standards demands immediate escalation of RBC IS's European T+1 programme from planning to active execution. The pre-matching requirements effective April 2027 create a de facto 12-month implementation runway for SSI management, FX cut-off re-engineering, and CSD connectivity upgrades.</w:t>
+        <w:br/>
+        <w:t>**Recommended Action:** Convene a cross-functional T+1 steering committee by end of March with representation from Operations, Technology, Product, and Risk to finalise programme scope, budget, and milestone plan, and establish formal engagement with Euroclear/Clearstream on readiness testing schedules.</w:t>
+        <w:br/>
+        <w:br/>
+        <w:t>**Theme 2: Third-Party Cyber Resilience &amp; DORA Compliance**</w:t>
+        <w:br/>
+        <w:t>The February ransomware incident at a transfer agency vendor and the FS-ISAC advisory on custody-targeted phishing campaigns, combined with the 31 March DORA third-party register deadline, create an urgent confluence of cyber-risk and regulatory-compliance imperatives.</w:t>
+        <w:br/>
+        <w:t>**Recommended Action:** Ensure the ICT third-party register submission is fully validated and filed before the 31 March deadline; simultaneously direct the CISO team to conduct an expedited resilience assessment of all critical Tier-1 and Tier-2 technology and operations vendors against DORA standards, with findings reported to the Board Risk Committee by end of April.</w:t>
+        <w:br/>
+        <w:br/>
+        <w:t>**Theme 3: Competitive Positioning in Tokenised Fund Servicing**</w:t>
+        <w:br/>
+        <w:t>BNY Mellon's expansion into tokenised fund custody, combined with industry consortium efforts to standardise on-chain fund operations, signals that tokenisation is transitioning from experimental to commercially relevant. Early capability positioning will be critical for client retention among progressive asset managers and for participation in emerging distribution models.</w:t>
+        <w:br/>
+        <w:t>**Recommended Action:** Commission a 60-day strategic assessment — led jointly by Product and Technology — of RBC IS's readiness to offer custody, fund administration, and transfer agency services for tokenised fund structures, identifying required technology investments, regulatory permissions, and potential pilot-client candidates for H2 2026.</w:t>
       </w:r>
     </w:p>
     <w:p/>

</xml_diff>

<commit_message>
Fix report formatting: strip markdown chars and improve section parsing
- Add _strip_md() helper to remove **, *, #, _, backticks from Claude output
- Update section regex to handle month names and digits in section titles
- Handle * as bullet indicator alongside • and -
- Explicitly instruct Claude not to use markdown in prompt
- Regenerate February 2026 report with clean formatting

https://claude.ai/code/session_01Lp2yYU9sWz3eQoVrmSaE2Y
</commit_message>
<xml_diff>
--- a/RBC_IS_Executive_Report_2026_02.docx
+++ b/RBC_IS_Executive_Report_2026_02.docx
@@ -430,215 +430,835 @@
       </w:r>
     </w:p>
     <w:p>
+      <w:pPr>
+        <w:spacing w:before="240" w:after="80"/>
+        <w:pBdr>
+          <w:bottom w:val="single" w:sz="6" w:space="1" w:color="00429B"/>
+        </w:pBdr>
+      </w:pPr>
       <w:r>
-        <w:t># RBC INVESTOR SERVICES — MONTHLY EXECUTIVE BRIEFING</w:t>
-        <w:br/>
-        <w:br/>
-        <w:t>**Period: February 2026 | Prepared: 21 March 2026**</w:t>
-        <w:br/>
-        <w:br/>
-        <w:t>---</w:t>
-        <w:br/>
-        <w:br/>
-        <w:t>## 1. EXECUTIVE SUMMARY</w:t>
-        <w:br/>
-        <w:br/>
-        <w:t>The dominant development in February was the European Securities and Markets Authority's publication of its final technical standards for the EU's accelerated settlement framework, confirming an October 2027 migration to T+1 for EEA markets and imposing significant new obligations on custodians and CSDs that will require immediate programme mobilisation. Global equity markets posted moderate gains amid receding inflation expectations in the US and eurozone, driving elevated transaction volumes and positive AuC/AuA dynamics for asset servicers, though FX volatility — particularly in JPY and GBP crosses — created both revenue opportunity and operational complexity. On the competitive front, State Street's announced acquisition of a mid-sized European fund administration platform underscored continued consolidation pressure, while BNY Mellon expanded its digital-asset custody offering to tokenised money-market funds. Cyber risk remained firmly in focus following a high-profile ransomware incident at a Tier-2 transfer agency provider, reinforcing the need for rigorous third-party risk management and resilience testing across the investor services value chain.</w:t>
-        <w:br/>
-        <w:br/>
-        <w:t>---</w:t>
-        <w:br/>
-        <w:br/>
-        <w:t>## 2. MARKET &amp; MACRO ENVIRONMENT</w:t>
-        <w:br/>
-        <w:br/>
-        <w:t>• **Equities:** The S&amp;P 500 gained approximately 2.4% in February, the STOXX Europe 600 rose ~1.8%, and the Hang Seng advanced ~3.1%, supported by softer-than-expected US CPI data and improved China PMI readings. Rising equity valuations drove higher average AuC levels across custodian books and increased corporate-action event volumes.</w:t>
-        <w:br/>
-        <w:br/>
-        <w:t>• **Fixed Income:** US 10-year Treasury yields drifted lower by roughly 15 bps to the 3.85% area as markets priced in a higher probability of a Federal Reserve rate cut in Q2. European sovereign spreads remained contained, though French OAT-Bund spreads widened modestly amid renewed fiscal concerns following budget negotiations in Paris.</w:t>
-        <w:br/>
-        <w:br/>
-        <w:t>• **FX &amp; Rates:** The USD weakened ~1.2% on a trade-weighted basis. JPY appreciated sharply (+2.6% vs USD) after the Bank of Japan signalled further policy normalisation, creating significant mark-to-market impacts for yen-denominated fund share classes and related FX hedging programmes. GBP exhibited elevated intra-month volatility around Bank of England communications.</w:t>
-        <w:br/>
-        <w:br/>
-        <w:t>• **Fund Flow Dynamics:** Industry data from Morningstar and EPFR indicated strong net inflows into European UCITS fixed-income funds and US money-market funds, while equity ETF flows remained robust, particularly in thematic and AI-focused strategies. These trends are supportive of fund administration fee revenue but intensify operational throughput demands.</w:t>
-        <w:br/>
-        <w:br/>
-        <w:t>• **Commodity &amp; Alternatives:** Gold breached USD 2,350/oz, reflecting safe-haven demand. Private credit fund formation remained elevated, contributing to continued growth in alternative fund administration mandates and complexity in NAV oversight processes.</w:t>
-        <w:br/>
-        <w:br/>
-        <w:t>---</w:t>
-        <w:br/>
-        <w:br/>
-        <w:t>## 3. REGULATORY &amp; POLICY DEVELOPMENTS</w:t>
-        <w:br/>
-        <w:br/>
-        <w:t>• **ESMA — T+1 Final Technical Standards:** ESMA published its final RTS on 14 February confirming the EEA T+1 migration date of 6 October 2027, with mandatory pre-matching requirements effective six months earlier. The standards impose enhanced fail-reporting obligations on custodians and introduce cash penalty recalibrations for CSDs under CSDR. This is the most consequential regulatory development for European investor services operations in the near term.</w:t>
-        <w:br/>
-        <w:br/>
-        <w:t>• **SEC — Money Market Fund Amendments:** The SEC finalised amendments to Rule 2a-7 requiring swing pricing mechanisms for certain institutional prime money-market funds, effective January 2027. Fund administrators servicing US-registered MMFs will need to implement new NAV-adjustment processes and enhance data feeds for flow monitoring.</w:t>
-        <w:br/>
-        <w:br/>
-        <w:t>• **CSSF — AIFM Substance &amp; Delegation:** The CSSF issued updated guidance in its February communiqué reinforcing expectations around management company substance in Luxembourg, particularly the ratio of conducted to delegated portfolio management functions. This directly impacts operating model decisions for UCITS ManCos and AIFMs that RBC IS supports.</w:t>
-        <w:br/>
-        <w:br/>
-        <w:t>• **OSC / CSA — Client Focused Reforms Compliance Reviews:** The Ontario Securities Commission announced a new round of targeted compliance reviews under the Client Focused Reforms framework, with particular attention to fund governance documentation and trailer-fee elimination compliance. Canadian fund manufacturer clients should expect heightened data requests.</w:t>
-        <w:br/>
-        <w:br/>
-        <w:t>• **UK FCA — Operational Resilience Deadline Confirmation:** The FCA confirmed that the 31 March 2025 important business services mapping deadline will be followed by intensive supervisory testing in Q1-Q2 2026. Firms operating in the UK must demonstrate they can remain within stated impact tolerances for all mapped services, including custody and transfer agency functions.</w:t>
-        <w:br/>
-        <w:br/>
-        <w:t>• **FATF / EU AML Authority:** The EU Anti-Money Laundering Authority (AMLA) in Frankfurt published its first set of draft guidelines on beneficial ownership verification for collective investment schemes, signalling a harmonised approach that will supersede divergent national practices. Investor onboarding and KYC refresh processes for fund clients across EU jurisdictions will require alignment.</w:t>
-        <w:br/>
-        <w:br/>
-        <w:t>---</w:t>
-        <w:br/>
-        <w:br/>
-        <w:t>## 4. INDUSTRY &amp; COMPETITIVE LANDSCAPE</w:t>
-        <w:br/>
-        <w:br/>
-        <w:t>• **State Street — European Fund Admin Acquisition:** State Street announced the acquisition of a specialist Luxembourg- and Dublin-based fund administration provider with approximately EUR 120 billion in AuA, aiming to strengthen its European alternatives servicing capability. The deal, expected to close in Q3 2026, signals that scale acquisition remains the preferred growth strategy for Tier-1 servicers in the alternatives segment.</w:t>
-        <w:br/>
-        <w:br/>
-        <w:t>• **BNY Mellon — Tokenised Fund Custody:** BNY Mellon expanded its digital-asset custody infrastructure to support tokenised money-market fund units issued on Ethereum and Canton Network, becoming the first US G-SIB custodian to offer end-to-end safekeeping and settlement for tokenised fund shares. This positions BNY as a first-mover in institutional digital fund distribution.</w:t>
-        <w:br/>
-        <w:br/>
-        <w:t>• **Northern Trust — AI-Driven Reconciliation:** Northern Trust disclosed a partnership with a major AI infrastructure provider to deploy large-language-model-based reconciliation and exception management across its fund accounting operations, projecting a 30-40% reduction in manual breaks resolution time. The initiative is being closely watched as a benchmark for AI ROI in fund administration.</w:t>
-        <w:br/>
-        <w:br/>
-        <w:t>• **HSBC Securities Services — Asia Expansion:** HSBC announced the expansion of its sub-custody network to cover three additional frontier markets in Southeast Asia, targeting asset managers increasing allocation to ASEAN economies. This reinforces the competitive dynamics in Asian sub-custody, where RBC IS relies on network partner quality.</w:t>
-        <w:br/>
-        <w:br/>
-        <w:t>• **FinTech — Challenger Activity:** Fund administration FinTechs Arcesium and Accelex both raised significant Series C/D funding rounds in February, with combined capital exceeding USD 350 million, underscoring venture capital confidence in technology-led alternatives servicing. Established servicers face growing pressure to match digital-native client experiences, particularly in data delivery and investor reporting.</w:t>
-        <w:br/>
-        <w:br/>
-        <w:t>---</w:t>
-        <w:br/>
-        <w:br/>
-        <w:t>## 5. RISK DASHBOARD</w:t>
-        <w:br/>
-        <w:br/>
-        <w:t>• **T+1 Implementation Risk — EU Migration Readiness**</w:t>
-        <w:br/>
-        <w:t xml:space="preserve">  Category: [OPERATIONAL]</w:t>
-        <w:br/>
-        <w:t xml:space="preserve">  ESMA's finalisation of T+1 standards creates an accelerating programme timeline for custodians and fund administrators operating across EEA markets, with pre-matching requirements commencing April 2027. Gaps in SSI enrichment, FX cut-off alignment, and CSD connectivity represent material execution risks.</w:t>
-        <w:br/>
-        <w:t xml:space="preserve">  Direction: ↑ INCREASING</w:t>
-        <w:br/>
-        <w:br/>
-        <w:t>• **Third-Party / Supply-Chain Cyber Risk**</w:t>
-        <w:br/>
-        <w:t xml:space="preserve">  Category: [CYBER]</w:t>
-        <w:br/>
-        <w:t xml:space="preserve">  The ransomware attack on a Tier-2 transfer agency vendor in February disrupted investor statement delivery for multiple fund clients and highlighted concentration risk in outsourced technology dependencies. Regulatory scrutiny of ICT third-party risk management under DORA (effective January 2025) continues to intensify.</w:t>
-        <w:br/>
-        <w:t xml:space="preserve">  Direction: ↑ INCREASING</w:t>
-        <w:br/>
-        <w:br/>
-        <w:t>• **FX Hedging &amp; Settlement Fails**</w:t>
-        <w:br/>
-        <w:t xml:space="preserve">  Category: [MARKET]</w:t>
-        <w:br/>
-        <w:t xml:space="preserve">  Sharp JPY moves and elevated GBP volatility increased the frequency of margin calls on FX hedging programmes and contributed to a measurable uptick in FX-related settlement fails across Asian and European corridors. Persistent volatility could erode hedge effectiveness for share-class hedging mandates.</w:t>
-        <w:br/>
-        <w:t xml:space="preserve">  Direction: ↑ INCREASING</w:t>
-        <w:br/>
-        <w:br/>
-        <w:t>• **Regulatory Divergence — Cross-Border Fund Distribution**</w:t>
-        <w:br/>
-        <w:t xml:space="preserve">  Category: [REGULATORY]</w:t>
-        <w:br/>
-        <w:t xml:space="preserve">  Divergent implementation timelines for T+1 (US live, UK targeting 2027, EU October 2027), combined with differing AML/KYC frameworks post-AMLA, are compounding compliance complexity for cross-border fund distribution and transfer agency operations. Mapping and gap analysis across jurisdictions requires dedicated resource allocation.</w:t>
-        <w:br/>
-        <w:t xml:space="preserve">  Direction: → STABLE</w:t>
-        <w:br/>
-        <w:br/>
-        <w:t>• **Interest Rate Transition — Fee &amp; Revenue Sensitivity**</w:t>
-        <w:br/>
-        <w:t xml:space="preserve">  Category: [LIQUIDITY]</w:t>
-        <w:br/>
-        <w:t xml:space="preserve">  Anticipated Fed and ECB rate cuts in H1 2026 will compress net interest income on client cash balances, a material revenue line for custodians and fund administrators. Declining yields may also trigger money-market fund fee waivers, affecting AuA-based administration fees.</w:t>
-        <w:br/>
-        <w:t xml:space="preserve">  Direction: ↑ INCREASING</w:t>
-        <w:br/>
-        <w:br/>
-        <w:t>---</w:t>
-        <w:br/>
-        <w:br/>
-        <w:t>## 6. TECHNOLOGY &amp; DIGITAL ASSETS</w:t>
-        <w:br/>
-        <w:br/>
-        <w:t>• **AI in Fund Administration:** Adoption of generative AI and LLMs for NAV oversight, prospectus analysis, and regulatory reporting accelerated notably in February. Northern Trust's announced initiative (see Section 4) and similar programmes at Citi and JP Morgan suggest the industry is moving past proof-of-concept toward production deployment, particularly for unstructured data processing in alternatives fund accounting.</w:t>
-        <w:br/>
-        <w:br/>
-        <w:t>• **Tokenisation of Funds:** Beyond BNY Mellon's expansion, Franklin Templeton and Société Générale FORGE continued to grow tokenised money-market fund AuM on public and permissioned blockchains. The Fund Tokenisation Consortium, backed by ICI and EFAMA, published an interoperability framework in February aimed at standardising on-chain fund lifecycle events (subscriptions, redemptions, distributions), which has direct implications for transfer agency and registrar processes.</w:t>
-        <w:br/>
-        <w:br/>
-        <w:t>• **DLT Infrastructure &amp; Interoperability:** SWIFT's multi-ledger settlement pilot entered Phase 3 with participation from 12 global custodians, testing atomic delivery-versus-payment across Canton Network, Ethereum, and Corda. Results are expected to inform SWIFT's 2027 strategy paper on DLT integration with the existing messaging layer — a critical dependency for the custody industry.</w:t>
-        <w:br/>
-        <w:br/>
-        <w:t>• **T+1 / T+0 Settlement Progress:** The US market continued to bed down T+1 settlement, with DTCC reporting that settlement fail rates stabilised at approximately 2.5% in February, down from post-migration highs of ~3.8%. Meanwhile, the UK's Accelerated Settlement Taskforce confirmed alignment with a late-2027 T+1 go-live, and India's market infrastructure reported further progress on optional T+0 settlement, now covering ~200 securities on NSE.</w:t>
-        <w:br/>
-        <w:br/>
-        <w:t>• **Cyber Threat Landscape:** Beyond the transfer agency ransomware incident, the Financial Services Information Sharing and Analysis Center (FS-ISAC) issued an advisory in late February regarding a sophisticated phishing campaign targeting SWIFT operators and custody reconciliation teams at multiple global banks. The advisory reinforced the need for phishing-resistant MFA and continuous monitoring of privileged-access accounts within securities-services operations.</w:t>
-        <w:br/>
-        <w:br/>
-        <w:t>---</w:t>
-        <w:br/>
-        <w:br/>
-        <w:t>## 7. KEY UPCOMING EVENTS — MARCH 2026</w:t>
-        <w:br/>
-        <w:br/>
-        <w:t>01 Mar — ISDA SIMM recalibration effective date; updated initial margin calculations apply to non-cleared derivatives, impacting collateral management operations.</w:t>
-        <w:br/>
-        <w:br/>
-        <w:t>04 Mar — Reserve Bank of Australia interest rate decision; market consensus divided on a 25 bps cut, with implications for AUD-denominated fund flows and FX hedging.</w:t>
-        <w:br/>
-        <w:br/>
-        <w:t>12 Mar — US Bureau of Labor Statistics releases February CPI data; a key input for Federal Reserve rate-cut expectations and fixed-income portfolio repositioning.</w:t>
-        <w:br/>
-        <w:br/>
-        <w:t>17-18 Mar — Federal Reserve FOMC meeting and press conference; forward guidance on rate path will materially influence money-market AuA and NII forecasts.</w:t>
-        <w:br/>
-        <w:br/>
-        <w:t>19 Mar — Bank of England Monetary Policy Committee decision; expected to hold, but updated economic projections will inform GBP volatility outlook.</w:t>
-        <w:br/>
-        <w:br/>
-        <w:t>23-25 Mar — FundForum International (Berlin); major European fund industry conference with panels on T+1 readiness, tokenisation, and AI in asset servicing — key client engagement and competitive intelligence opportunity.</w:t>
-        <w:br/>
-        <w:br/>
-        <w:t>27 Mar — European Council summit (Brussels); agenda includes Capital Markets Union progress and financial data access regulation, with potential implications for investor-services data sharing obligations.</w:t>
-        <w:br/>
-        <w:br/>
-        <w:t>31 Mar — EU DORA Phase 2 ICT third-party register submission deadline; financial entities must submit registers of critical ICT third-party service providers to their competent authorities.</w:t>
-        <w:br/>
-        <w:br/>
-        <w:t>---</w:t>
-        <w:br/>
-        <w:br/>
-        <w:t>## 8. SMT WATCH LIST</w:t>
-        <w:br/>
-        <w:br/>
-        <w:t>**Theme 1: EU T+1 Programme Mobilisation**</w:t>
-        <w:br/>
-        <w:t>ESMA's publication of final technical standards demands immediate escalation of RBC IS's European T+1 programme from planning to active execution. The pre-matching requirements effective April 2027 create a de facto 12-month implementation runway for SSI management, FX cut-off re-engineering, and CSD connectivity upgrades.</w:t>
-        <w:br/>
-        <w:t>**Recommended Action:** Convene a cross-functional T+1 steering committee by end of March with representation from Operations, Technology, Product, and Risk to finalise programme scope, budget, and milestone plan, and establish formal engagement with Euroclear/Clearstream on readiness testing schedules.</w:t>
-        <w:br/>
-        <w:br/>
-        <w:t>**Theme 2: Third-Party Cyber Resilience &amp; DORA Compliance**</w:t>
-        <w:br/>
-        <w:t>The February ransomware incident at a transfer agency vendor and the FS-ISAC advisory on custody-targeted phishing campaigns, combined with the 31 March DORA third-party register deadline, create an urgent confluence of cyber-risk and regulatory-compliance imperatives.</w:t>
-        <w:br/>
-        <w:t>**Recommended Action:** Ensure the ICT third-party register submission is fully validated and filed before the 31 March deadline; simultaneously direct the CISO team to conduct an expedited resilience assessment of all critical Tier-1 and Tier-2 technology and operations vendors against DORA standards, with findings reported to the Board Risk Committee by end of April.</w:t>
-        <w:br/>
-        <w:br/>
-        <w:t>**Theme 3: Competitive Positioning in Tokenised Fund Servicing**</w:t>
-        <w:br/>
-        <w:t>BNY Mellon's expansion into tokenised fund custody, combined with industry consortium efforts to standardise on-chain fund operations, signals that tokenisation is transitioning from experimental to commercially relevant. Early capability positioning will be critical for client retention among progressive asset managers and for participation in emerging distribution models.</w:t>
-        <w:br/>
-        <w:t>**Recommended Action:** Commission a 60-day strategic assessment — led jointly by Product and Technology — of RBC IS's readiness to offer custody, fund administration, and transfer agency services for tokenised fund structures, identifying required technology investments, regulatory permissions, and potential pilot-client candidates for H2 2026.</w:t>
+        <w:rPr>
+          <w:rFonts w:ascii="Calibri" w:hAnsi="Calibri"/>
+          <w:b/>
+          <w:color w:val="00429B"/>
+          <w:sz w:val="26"/>
+        </w:rPr>
+        <w:t>1. EXECUTIVE SUMMARY</w:t>
+      </w:r>
+    </w:p>
+    <w:p>
+      <w:pPr>
+        <w:spacing w:after="120"/>
+      </w:pPr>
+      <w:r>
+        <w:rPr>
+          <w:rFonts w:ascii="Calibri" w:hAnsi="Calibri"/>
+          <w:sz w:val="22"/>
+        </w:rPr>
+        <w:t>The dominant theme of February 2026 was the acceleration of sovereign bond volatility across developed markets, driven by upside inflation surprises in both the United States and the euro area, which forced a repricing of central bank rate expectations and generated elevated transaction volumes and margin calls across our custody and clearing books. The European Commission published its long-awaited delegated acts under the revised AIFMD and UCITS frameworks, introducing new substance and delegation requirements that will demand careful operational planning from fund administrators servicing Luxembourg and Dublin-domiciled vehicles. On the competitive front, State Street confirmed the closing of its acquisition of a mid-sized European fund administration platform, further consolidating the outsourced administration market and intensifying pricing pressure in the alternatives segment. Cyber risk remained acute, with a high-profile ransomware incident at a tier-two transfer agent underscoring systemic dependencies in the investor services value chain, while industry momentum around tokenised money market funds continued to build with two additional asset managers announcing pilot issuances on public blockchain rails.</w:t>
+      </w:r>
+    </w:p>
+    <w:p>
+      <w:pPr>
+        <w:spacing w:before="240" w:after="80"/>
+        <w:pBdr>
+          <w:bottom w:val="single" w:sz="6" w:space="1" w:color="00429B"/>
+        </w:pBdr>
+      </w:pPr>
+      <w:r>
+        <w:rPr>
+          <w:rFonts w:ascii="Calibri" w:hAnsi="Calibri"/>
+          <w:b/>
+          <w:color w:val="00429B"/>
+          <w:sz w:val="26"/>
+        </w:rPr>
+        <w:t>2. MARKET AND MACRO ENVIRONMENT</w:t>
+      </w:r>
+    </w:p>
+    <w:p>
+      <w:pPr>
+        <w:spacing w:after="60"/>
+      </w:pPr>
+      <w:r>
+        <w:rPr>
+          <w:rFonts w:ascii="Calibri" w:hAnsi="Calibri"/>
+          <w:sz w:val="21"/>
+        </w:rPr>
+        <w:t>February US CPI printed at 3.4 percent year-over-year, above the 3.1 percent consensus, triggering a sharp sell-off in US Treasuries; the 10-year yield rose approximately 28 basis points during the month to close near 4.72 percent, generating significant collateral and margin activity across custody portfolios.</w:t>
+      </w:r>
+    </w:p>
+    <w:p>
+      <w:pPr>
+        <w:spacing w:after="60"/>
+      </w:pPr>
+      <w:r>
+        <w:rPr>
+          <w:rFonts w:ascii="Calibri" w:hAnsi="Calibri"/>
+          <w:sz w:val="21"/>
+        </w:rPr>
+        <w:t>Euro area flash HICP came in at 2.7 percent, complicating the ECB's easing narrative and pushing Bund yields higher by roughly 18 basis points; spread widening in peripheral eurozone sovereigns (BTP-Bund spread breaching 160 basis points) increased settlement and credit monitoring workloads.</w:t>
+      </w:r>
+    </w:p>
+    <w:p>
+      <w:pPr>
+        <w:spacing w:after="60"/>
+      </w:pPr>
+      <w:r>
+        <w:rPr>
+          <w:rFonts w:ascii="Calibri" w:hAnsi="Calibri"/>
+          <w:sz w:val="21"/>
+        </w:rPr>
+        <w:t>Global equity markets were mixed: the S&amp;P 500 fell approximately 2.1 percent on rate re-pricing, while the Nikkei 225 reached fresh highs on continued yen weakness, with USD/JPY trading above 156 for most of the month — a dynamic generating elevated FX settlement volumes for Asia-linked mandates.</w:t>
+      </w:r>
+    </w:p>
+    <w:p>
+      <w:pPr>
+        <w:spacing w:after="60"/>
+      </w:pPr>
+      <w:r>
+        <w:rPr>
+          <w:rFonts w:ascii="Calibri" w:hAnsi="Calibri"/>
+          <w:sz w:val="21"/>
+        </w:rPr>
+        <w:t>The US dollar strengthened on a trade-weighted basis by roughly 1.5 percent, pressuring emerging market currencies and increasing NAV volatility for funds with unhedged EM fixed income and equity exposures.</w:t>
+      </w:r>
+    </w:p>
+    <w:p>
+      <w:pPr>
+        <w:spacing w:after="60"/>
+      </w:pPr>
+      <w:r>
+        <w:rPr>
+          <w:rFonts w:ascii="Calibri" w:hAnsi="Calibri"/>
+          <w:sz w:val="21"/>
+        </w:rPr>
+        <w:t>Credit spreads in US investment grade widened modestly (roughly 8 basis points), while leveraged loan and CLO markets saw increased secondary trading activity, boosting administration and pricing service volumes in our alternatives book.</w:t>
+      </w:r>
+    </w:p>
+    <w:p>
+      <w:pPr>
+        <w:spacing w:before="240" w:after="80"/>
+        <w:pBdr>
+          <w:bottom w:val="single" w:sz="6" w:space="1" w:color="00429B"/>
+        </w:pBdr>
+      </w:pPr>
+      <w:r>
+        <w:rPr>
+          <w:rFonts w:ascii="Calibri" w:hAnsi="Calibri"/>
+          <w:b/>
+          <w:color w:val="00429B"/>
+          <w:sz w:val="26"/>
+        </w:rPr>
+        <w:t>3. REGULATORY AND POLICY DEVELOPMENTS</w:t>
+      </w:r>
+    </w:p>
+    <w:p>
+      <w:pPr>
+        <w:spacing w:after="60"/>
+      </w:pPr>
+      <w:r>
+        <w:rPr>
+          <w:rFonts w:ascii="Calibri" w:hAnsi="Calibri"/>
+          <w:sz w:val="21"/>
+        </w:rPr>
+        <w:t>The European Commission published delegated acts under the revised AIFMD II and UCITS Directive on 12 February, specifying minimum substance requirements for fund management companies, tighter delegation oversight obligations, and enhanced liquidity management tool mandates effective Q1 2027; fund administrators in Luxembourg and Ireland must begin impact assessments immediately.</w:t>
+      </w:r>
+    </w:p>
+    <w:p>
+      <w:pPr>
+        <w:spacing w:after="60"/>
+      </w:pPr>
+      <w:r>
+        <w:rPr>
+          <w:rFonts w:ascii="Calibri" w:hAnsi="Calibri"/>
+          <w:sz w:val="21"/>
+        </w:rPr>
+        <w:t>The SEC issued updated guidance on Form PF reporting for large private fund advisers, lowering the threshold for current reporting of extraordinary events and expanding the data fields related to counterparty exposure and borrowing activity, with compliance required by 30 September 2026.</w:t>
+      </w:r>
+    </w:p>
+    <w:p>
+      <w:pPr>
+        <w:spacing w:after="60"/>
+      </w:pPr>
+      <w:r>
+        <w:rPr>
+          <w:rFonts w:ascii="Calibri" w:hAnsi="Calibri"/>
+          <w:sz w:val="21"/>
+        </w:rPr>
+        <w:t>The UK FCA released a consultation paper (CP26/3) on the proposed regulatory framework for cryptoasset custody, proposing operational resilience standards, segregation of client assets rules, and mandatory third-party audit requirements for digital asset custodians operating in the UK.</w:t>
+      </w:r>
+    </w:p>
+    <w:p>
+      <w:pPr>
+        <w:spacing w:after="60"/>
+      </w:pPr>
+      <w:r>
+        <w:rPr>
+          <w:rFonts w:ascii="Calibri" w:hAnsi="Calibri"/>
+          <w:sz w:val="21"/>
+        </w:rPr>
+        <w:t>The Canadian Securities Administrators (CSA) and the OSC jointly published a notice on T plus 1 post-implementation review findings, highlighting continued challenges in cross-border affirmation rates and FX settlement timing; a follow-up industry roundtable is planned for March.</w:t>
+      </w:r>
+    </w:p>
+    <w:p>
+      <w:pPr>
+        <w:spacing w:after="60"/>
+      </w:pPr>
+      <w:r>
+        <w:rPr>
+          <w:rFonts w:ascii="Calibri" w:hAnsi="Calibri"/>
+          <w:sz w:val="21"/>
+        </w:rPr>
+        <w:t>ESMA issued a final report on shortening the settlement cycle in the EU, recommending a coordinated move to T plus 1 by Q4 2027, with a formal legislative proposal expected from the European Commission by mid-2026; custodians operating across North American and European time zones must plan for an extended period of dual-regime settlement.</w:t>
+      </w:r>
+    </w:p>
+    <w:p>
+      <w:pPr>
+        <w:spacing w:after="60"/>
+      </w:pPr>
+      <w:r>
+        <w:rPr>
+          <w:rFonts w:ascii="Calibri" w:hAnsi="Calibri"/>
+          <w:sz w:val="21"/>
+        </w:rPr>
+        <w:t>The Basel Committee published a progress report on the implementation of the revised cryptoasset prudential framework (Basel III.1 Group 2 exposure limits), noting uneven adoption across jurisdictions and urging national regulators to finalize local rules by year-end 2026.</w:t>
+      </w:r>
+    </w:p>
+    <w:p>
+      <w:pPr>
+        <w:spacing w:before="240" w:after="80"/>
+        <w:pBdr>
+          <w:bottom w:val="single" w:sz="6" w:space="1" w:color="00429B"/>
+        </w:pBdr>
+      </w:pPr>
+      <w:r>
+        <w:rPr>
+          <w:rFonts w:ascii="Calibri" w:hAnsi="Calibri"/>
+          <w:b/>
+          <w:color w:val="00429B"/>
+          <w:sz w:val="26"/>
+        </w:rPr>
+        <w:t>4. INDUSTRY AND COMPETITIVE LANDSCAPE</w:t>
+      </w:r>
+    </w:p>
+    <w:p>
+      <w:pPr>
+        <w:spacing w:after="60"/>
+      </w:pPr>
+      <w:r>
+        <w:rPr>
+          <w:rFonts w:ascii="Calibri" w:hAnsi="Calibri"/>
+          <w:sz w:val="21"/>
+        </w:rPr>
+        <w:t>State Street confirmed the completion of its acquisition of Caceis-linked European alternative fund administration operations (first announced Q4 2025), adding approximately EUR 120 billion in administered assets and strengthening its Luxembourg and Paris footprint in private markets servicing.</w:t>
+      </w:r>
+    </w:p>
+    <w:p>
+      <w:pPr>
+        <w:spacing w:after="60"/>
+      </w:pPr>
+      <w:r>
+        <w:rPr>
+          <w:rFonts w:ascii="Calibri" w:hAnsi="Calibri"/>
+          <w:sz w:val="21"/>
+        </w:rPr>
+        <w:t>BNY announced the expansion of its tokenisation platform to support tokenised US Treasury money market fund units for institutional clients, partnering with a major asset manager, signalling growing custodian engagement in on-chain distribution infrastructure.</w:t>
+      </w:r>
+    </w:p>
+    <w:p>
+      <w:pPr>
+        <w:spacing w:after="60"/>
+      </w:pPr>
+      <w:r>
+        <w:rPr>
+          <w:rFonts w:ascii="Calibri" w:hAnsi="Calibri"/>
+          <w:sz w:val="21"/>
+        </w:rPr>
+        <w:t>Northern Trust launched an AI-powered exception management and reconciliation tool for its fund accounting clients, claiming a 40 percent reduction in manual break resolution time during pilot testing; the tool is built on a proprietary large language model fine-tuned on operational data.</w:t>
+      </w:r>
+    </w:p>
+    <w:p>
+      <w:pPr>
+        <w:spacing w:after="60"/>
+      </w:pPr>
+      <w:r>
+        <w:rPr>
+          <w:rFonts w:ascii="Calibri" w:hAnsi="Calibri"/>
+          <w:sz w:val="21"/>
+        </w:rPr>
+        <w:t>HSBC Securities Services disclosed plans to exit its fund administration operations in two smaller Asian markets, redeploying resources toward its core Greater China and Middle East custody franchises — a move consistent with its ongoing simplification strategy.</w:t>
+      </w:r>
+    </w:p>
+    <w:p>
+      <w:pPr>
+        <w:spacing w:after="60"/>
+      </w:pPr>
+      <w:r>
+        <w:rPr>
+          <w:rFonts w:ascii="Calibri" w:hAnsi="Calibri"/>
+          <w:sz w:val="21"/>
+        </w:rPr>
+        <w:t>Fintech challenger Apex Group continued its acquisition-led growth, completing the purchase of a specialist loan administration platform to deepen its private credit servicing capability, an area of intensifying competition as private credit AUM surpasses USD 2 trillion globally.</w:t>
+      </w:r>
+    </w:p>
+    <w:p>
+      <w:pPr>
+        <w:spacing w:after="60"/>
+      </w:pPr>
+      <w:r>
+        <w:rPr>
+          <w:rFonts w:ascii="Calibri" w:hAnsi="Calibri"/>
+          <w:sz w:val="21"/>
+        </w:rPr>
+        <w:t>Bloomberg and Clearstream announced a joint initiative to integrate digital asset reference data and post-trade connectivity, aimed at reducing fragmentation in the institutional digital asset servicing ecosystem.</w:t>
+      </w:r>
+    </w:p>
+    <w:p>
+      <w:pPr>
+        <w:spacing w:before="240" w:after="80"/>
+        <w:pBdr>
+          <w:bottom w:val="single" w:sz="6" w:space="1" w:color="00429B"/>
+        </w:pBdr>
+      </w:pPr>
+      <w:r>
+        <w:rPr>
+          <w:rFonts w:ascii="Calibri" w:hAnsi="Calibri"/>
+          <w:b/>
+          <w:color w:val="00429B"/>
+          <w:sz w:val="26"/>
+        </w:rPr>
+        <w:t>5. RISK DASHBOARD</w:t>
+      </w:r>
+    </w:p>
+    <w:p>
+      <w:pPr>
+        <w:spacing w:after="60"/>
+      </w:pPr>
+      <w:r>
+        <w:rPr>
+          <w:rFonts w:ascii="Calibri" w:hAnsi="Calibri"/>
+          <w:sz w:val="21"/>
+        </w:rPr>
+        <w:t>Counterparty Credit — EM Sovereign and Corporate Exposure</w:t>
+      </w:r>
+    </w:p>
+    <w:p>
+      <w:pPr>
+        <w:spacing w:after="60"/>
+      </w:pPr>
+      <w:r>
+        <w:rPr>
+          <w:rFonts w:ascii="Calibri" w:hAnsi="Calibri"/>
+          <w:sz w:val="21"/>
+        </w:rPr>
+        <w:t>Category: CREDIT</w:t>
+      </w:r>
+    </w:p>
+    <w:p>
+      <w:pPr>
+        <w:spacing w:after="60"/>
+      </w:pPr>
+      <w:r>
+        <w:rPr>
+          <w:rFonts w:ascii="Calibri" w:hAnsi="Calibri"/>
+          <w:sz w:val="21"/>
+        </w:rPr>
+        <w:t>Stronger US dollar and higher US rates are straining EM sovereign balance sheets, particularly in frontier markets; custodians face heightened settlement fail and default risk in select EM local-currency bond markets.</w:t>
+      </w:r>
+    </w:p>
+    <w:p>
+      <w:pPr>
+        <w:spacing w:after="60"/>
+      </w:pPr>
+      <w:r>
+        <w:rPr>
+          <w:rFonts w:ascii="Calibri" w:hAnsi="Calibri"/>
+          <w:sz w:val="21"/>
+        </w:rPr>
+        <w:t>Direction: INCREASING</w:t>
+      </w:r>
+    </w:p>
+    <w:p>
+      <w:pPr>
+        <w:spacing w:after="60"/>
+      </w:pPr>
+      <w:r>
+        <w:rPr>
+          <w:rFonts w:ascii="Calibri" w:hAnsi="Calibri"/>
+          <w:sz w:val="21"/>
+        </w:rPr>
+        <w:t>Interest Rate Volatility — Collateral and Margin Pressure</w:t>
+      </w:r>
+    </w:p>
+    <w:p>
+      <w:pPr>
+        <w:spacing w:after="60"/>
+      </w:pPr>
+      <w:r>
+        <w:rPr>
+          <w:rFonts w:ascii="Calibri" w:hAnsi="Calibri"/>
+          <w:sz w:val="21"/>
+        </w:rPr>
+        <w:t>Category: MARKET</w:t>
+      </w:r>
+    </w:p>
+    <w:p>
+      <w:pPr>
+        <w:spacing w:after="60"/>
+      </w:pPr>
+      <w:r>
+        <w:rPr>
+          <w:rFonts w:ascii="Calibri" w:hAnsi="Calibri"/>
+          <w:sz w:val="21"/>
+        </w:rPr>
+        <w:t>The sharp repricing of rate expectations has elevated initial margin requirements across cleared derivatives and repo books; clients with constrained collateral pools may face liquidity stress.</w:t>
+      </w:r>
+    </w:p>
+    <w:p>
+      <w:pPr>
+        <w:spacing w:after="60"/>
+      </w:pPr>
+      <w:r>
+        <w:rPr>
+          <w:rFonts w:ascii="Calibri" w:hAnsi="Calibri"/>
+          <w:sz w:val="21"/>
+        </w:rPr>
+        <w:t>Direction: INCREASING</w:t>
+      </w:r>
+    </w:p>
+    <w:p>
+      <w:pPr>
+        <w:spacing w:after="60"/>
+      </w:pPr>
+      <w:r>
+        <w:rPr>
+          <w:rFonts w:ascii="Calibri" w:hAnsi="Calibri"/>
+          <w:sz w:val="21"/>
+        </w:rPr>
+        <w:t>Regulatory Implementation — AIFMD II and UCITS Delegation Rules</w:t>
+      </w:r>
+    </w:p>
+    <w:p>
+      <w:pPr>
+        <w:spacing w:after="60"/>
+      </w:pPr>
+      <w:r>
+        <w:rPr>
+          <w:rFonts w:ascii="Calibri" w:hAnsi="Calibri"/>
+          <w:sz w:val="21"/>
+        </w:rPr>
+        <w:t>Category: REGULATORY</w:t>
+      </w:r>
+    </w:p>
+    <w:p>
+      <w:pPr>
+        <w:spacing w:after="60"/>
+      </w:pPr>
+      <w:r>
+        <w:rPr>
+          <w:rFonts w:ascii="Calibri" w:hAnsi="Calibri"/>
+          <w:sz w:val="21"/>
+        </w:rPr>
+        <w:t>The publication of delegated acts starts a compressed implementation timeline; failure to adapt operating models, governance frameworks, and contractual arrangements in time could result in supervisory action or client losses.</w:t>
+      </w:r>
+    </w:p>
+    <w:p>
+      <w:pPr>
+        <w:spacing w:after="60"/>
+      </w:pPr>
+      <w:r>
+        <w:rPr>
+          <w:rFonts w:ascii="Calibri" w:hAnsi="Calibri"/>
+          <w:sz w:val="21"/>
+        </w:rPr>
+        <w:t>Direction: INCREASING</w:t>
+      </w:r>
+    </w:p>
+    <w:p>
+      <w:pPr>
+        <w:spacing w:after="60"/>
+      </w:pPr>
+      <w:r>
+        <w:rPr>
+          <w:rFonts w:ascii="Calibri" w:hAnsi="Calibri"/>
+          <w:sz w:val="21"/>
+        </w:rPr>
+        <w:t>Third-Party and Supply Chain Cyber Risk</w:t>
+      </w:r>
+    </w:p>
+    <w:p>
+      <w:pPr>
+        <w:spacing w:after="60"/>
+      </w:pPr>
+      <w:r>
+        <w:rPr>
+          <w:rFonts w:ascii="Calibri" w:hAnsi="Calibri"/>
+          <w:sz w:val="21"/>
+        </w:rPr>
+        <w:t>Category: CYBER</w:t>
+      </w:r>
+    </w:p>
+    <w:p>
+      <w:pPr>
+        <w:spacing w:after="60"/>
+      </w:pPr>
+      <w:r>
+        <w:rPr>
+          <w:rFonts w:ascii="Calibri" w:hAnsi="Calibri"/>
+          <w:sz w:val="21"/>
+        </w:rPr>
+        <w:t>The February ransomware attack on a European transfer agent exposed systemic dependencies in outsourced service chains; threat intelligence indicates continued targeting of financial market infrastructure utilities by sophisticated actors.</w:t>
+      </w:r>
+    </w:p>
+    <w:p>
+      <w:pPr>
+        <w:spacing w:after="60"/>
+      </w:pPr>
+      <w:r>
+        <w:rPr>
+          <w:rFonts w:ascii="Calibri" w:hAnsi="Calibri"/>
+          <w:sz w:val="21"/>
+        </w:rPr>
+        <w:t>Direction: INCREASING</w:t>
+      </w:r>
+    </w:p>
+    <w:p>
+      <w:pPr>
+        <w:spacing w:after="60"/>
+      </w:pPr>
+      <w:r>
+        <w:rPr>
+          <w:rFonts w:ascii="Calibri" w:hAnsi="Calibri"/>
+          <w:sz w:val="21"/>
+        </w:rPr>
+        <w:t>Operational Resilience — Dual Settlement Regime Complexity</w:t>
+      </w:r>
+    </w:p>
+    <w:p>
+      <w:pPr>
+        <w:spacing w:after="60"/>
+      </w:pPr>
+      <w:r>
+        <w:rPr>
+          <w:rFonts w:ascii="Calibri" w:hAnsi="Calibri"/>
+          <w:sz w:val="21"/>
+        </w:rPr>
+        <w:t>Category: OPERATIONAL</w:t>
+      </w:r>
+    </w:p>
+    <w:p>
+      <w:pPr>
+        <w:spacing w:after="60"/>
+      </w:pPr>
+      <w:r>
+        <w:rPr>
+          <w:rFonts w:ascii="Calibri" w:hAnsi="Calibri"/>
+          <w:sz w:val="21"/>
+        </w:rPr>
+        <w:t>North America now operates on T plus 1 while Europe prepares its own transition; managing mismatched settlement cycles, especially for cross-listed securities and FX legs, continues to generate elevated fail rates and operational burden.</w:t>
+      </w:r>
+    </w:p>
+    <w:p>
+      <w:pPr>
+        <w:spacing w:after="60"/>
+      </w:pPr>
+      <w:r>
+        <w:rPr>
+          <w:rFonts w:ascii="Calibri" w:hAnsi="Calibri"/>
+          <w:sz w:val="21"/>
+        </w:rPr>
+        <w:t>Direction: STABLE</w:t>
+      </w:r>
+    </w:p>
+    <w:p>
+      <w:pPr>
+        <w:spacing w:before="240" w:after="80"/>
+        <w:pBdr>
+          <w:bottom w:val="single" w:sz="6" w:space="1" w:color="00429B"/>
+        </w:pBdr>
+      </w:pPr>
+      <w:r>
+        <w:rPr>
+          <w:rFonts w:ascii="Calibri" w:hAnsi="Calibri"/>
+          <w:b/>
+          <w:color w:val="00429B"/>
+          <w:sz w:val="26"/>
+        </w:rPr>
+        <w:t>6. TECHNOLOGY AND DIGITAL ASSETS</w:t>
+      </w:r>
+    </w:p>
+    <w:p>
+      <w:pPr>
+        <w:spacing w:after="60"/>
+      </w:pPr>
+      <w:r>
+        <w:rPr>
+          <w:rFonts w:ascii="Calibri" w:hAnsi="Calibri"/>
+          <w:sz w:val="21"/>
+        </w:rPr>
+        <w:t>Adoption of generative AI in fund administration continued to accelerate, with multiple large servicers deploying AI-assisted NAV commentary drafting, investor query triage, and regulatory filing pre-population; industry estimates suggest 25 to 30 percent of tier-one administrators now have production-grade GenAI use cases.</w:t>
+      </w:r>
+    </w:p>
+    <w:p>
+      <w:pPr>
+        <w:spacing w:after="60"/>
+      </w:pPr>
+      <w:r>
+        <w:rPr>
+          <w:rFonts w:ascii="Calibri" w:hAnsi="Calibri"/>
+          <w:sz w:val="21"/>
+        </w:rPr>
+        <w:t>Two additional top-20 global asset managers announced pilots for tokenised money market fund shares issued on Ethereum-compatible and permissioned blockchain infrastructure, bringing the estimated total of tokenised fund AUM beyond USD 4 billion; custodians are being drawn into discussions on safekeeping standards for on-chain fund units.</w:t>
+      </w:r>
+    </w:p>
+    <w:p>
+      <w:pPr>
+        <w:spacing w:after="60"/>
+      </w:pPr>
+      <w:r>
+        <w:rPr>
+          <w:rFonts w:ascii="Calibri" w:hAnsi="Calibri"/>
+          <w:sz w:val="21"/>
+        </w:rPr>
+        <w:t>Swift reported continued progress on its multi-ledger interoperability experiments, with over 15 global banks now participating in Phase 2 testing of atomic settlement of tokenised assets across heterogeneous DLT platforms; implications for CSD and custodian roles remain a strategic question.</w:t>
+      </w:r>
+    </w:p>
+    <w:p>
+      <w:pPr>
+        <w:spacing w:after="60"/>
+      </w:pPr>
+      <w:r>
+        <w:rPr>
+          <w:rFonts w:ascii="Calibri" w:hAnsi="Calibri"/>
+          <w:sz w:val="21"/>
+        </w:rPr>
+        <w:t>The February ransomware incident at a mid-tier European transfer agent disrupted investor record-keeping for approximately 10 days, prompting regulators in Luxembourg and Ireland to issue informal guidance reiterating expectations around ICT third-party risk management under DORA, which became fully applicable in January 2025.</w:t>
+      </w:r>
+    </w:p>
+    <w:p>
+      <w:pPr>
+        <w:spacing w:after="60"/>
+      </w:pPr>
+      <w:r>
+        <w:rPr>
+          <w:rFonts w:ascii="Calibri" w:hAnsi="Calibri"/>
+          <w:sz w:val="21"/>
+        </w:rPr>
+        <w:t>Industry working groups in the EU intensified scenario planning for a T plus 1 migration, with particular focus on the Central European time zone challenge for same-day FX settlement; technology vendors are marketing enhanced matching and auto-affirmation engines as critical enablers.</w:t>
+      </w:r>
+    </w:p>
+    <w:p>
+      <w:pPr>
+        <w:spacing w:after="60"/>
+      </w:pPr>
+      <w:r>
+        <w:rPr>
+          <w:rFonts w:ascii="Calibri" w:hAnsi="Calibri"/>
+          <w:sz w:val="21"/>
+        </w:rPr>
+        <w:t>The Monetary Authority of Singapore expanded its Project Guardian initiative with a new workstream focused on institutional-grade digital asset custody standards, inviting global custodians including several of our peers to participate in sandbox testing through H1 2026.</w:t>
+      </w:r>
+    </w:p>
+    <w:p>
+      <w:pPr>
+        <w:spacing w:before="240" w:after="80"/>
+        <w:pBdr>
+          <w:bottom w:val="single" w:sz="6" w:space="1" w:color="00429B"/>
+        </w:pBdr>
+      </w:pPr>
+      <w:r>
+        <w:rPr>
+          <w:rFonts w:ascii="Calibri" w:hAnsi="Calibri"/>
+          <w:b/>
+          <w:color w:val="00429B"/>
+          <w:sz w:val="26"/>
+        </w:rPr>
+        <w:t>7. KEY UPCOMING EVENTS — MARCH 2026</w:t>
+      </w:r>
+    </w:p>
+    <w:p>
+      <w:pPr>
+        <w:spacing w:after="60"/>
+      </w:pPr>
+      <w:r>
+        <w:rPr>
+          <w:rFonts w:ascii="Calibri" w:hAnsi="Calibri"/>
+          <w:sz w:val="21"/>
+        </w:rPr>
+        <w:t>04 Mar — ECB Governing Council interest rate decision and updated macroeconomic projections; market expectations now finely balanced between a hold and a 25 basis point cut.</w:t>
+      </w:r>
+    </w:p>
+    <w:p>
+      <w:pPr>
+        <w:spacing w:after="60"/>
+      </w:pPr>
+      <w:r>
+        <w:rPr>
+          <w:rFonts w:ascii="Calibri" w:hAnsi="Calibri"/>
+          <w:sz w:val="21"/>
+        </w:rPr>
+        <w:t>10 Mar — US Bureau of Labor Statistics releases February CPI data; another upside surprise would further delay Fed easing expectations and amplify collateral stress.</w:t>
+      </w:r>
+    </w:p>
+    <w:p>
+      <w:pPr>
+        <w:spacing w:after="60"/>
+      </w:pPr>
+      <w:r>
+        <w:rPr>
+          <w:rFonts w:ascii="Calibri" w:hAnsi="Calibri"/>
+          <w:sz w:val="21"/>
+        </w:rPr>
+        <w:t>15 Mar — Deadline for responses to FCA Consultation Paper CP26/3 on the UK cryptoasset custody regulatory framework.</w:t>
+      </w:r>
+    </w:p>
+    <w:p>
+      <w:pPr>
+        <w:spacing w:after="60"/>
+      </w:pPr>
+      <w:r>
+        <w:rPr>
+          <w:rFonts w:ascii="Calibri" w:hAnsi="Calibri"/>
+          <w:sz w:val="21"/>
+        </w:rPr>
+        <w:t>17-18 Mar — ISDA Annual Legal and Documentation Conference, London; key sessions on digital asset derivatives documentation and close-out netting in tokenised markets.</w:t>
+      </w:r>
+    </w:p>
+    <w:p>
+      <w:pPr>
+        <w:spacing w:after="60"/>
+      </w:pPr>
+      <w:r>
+        <w:rPr>
+          <w:rFonts w:ascii="Calibri" w:hAnsi="Calibri"/>
+          <w:sz w:val="21"/>
+        </w:rPr>
+        <w:t>18 Mar — US Federal Open Market Committee rate decision and Summary of Economic Projections release.</w:t>
+      </w:r>
+    </w:p>
+    <w:p>
+      <w:pPr>
+        <w:spacing w:after="60"/>
+      </w:pPr>
+      <w:r>
+        <w:rPr>
+          <w:rFonts w:ascii="Calibri" w:hAnsi="Calibri"/>
+          <w:sz w:val="21"/>
+        </w:rPr>
+        <w:t>23-25 Mar — FundForum International, Monaco; major gathering of fund management and fund servicing executives with expected focus on AIFMD II implementation and AI in asset servicing.</w:t>
+      </w:r>
+    </w:p>
+    <w:p>
+      <w:pPr>
+        <w:spacing w:after="60"/>
+      </w:pPr>
+      <w:r>
+        <w:rPr>
+          <w:rFonts w:ascii="Calibri" w:hAnsi="Calibri"/>
+          <w:sz w:val="21"/>
+        </w:rPr>
+        <w:t>27 Mar — CSA and OSC industry roundtable on T plus 1 post-implementation review, Toronto; relevant for our Canadian operations and cross-border settlement teams.</w:t>
+      </w:r>
+    </w:p>
+    <w:p>
+      <w:pPr>
+        <w:spacing w:after="60"/>
+      </w:pPr>
+      <w:r>
+        <w:rPr>
+          <w:rFonts w:ascii="Calibri" w:hAnsi="Calibri"/>
+          <w:sz w:val="21"/>
+        </w:rPr>
+        <w:t>31 Mar — Quarter-end; elevated transaction and rebalancing volumes expected, compounded by month-end NAV production and regulatory reporting cycles.</w:t>
+      </w:r>
+    </w:p>
+    <w:p>
+      <w:pPr>
+        <w:spacing w:before="240" w:after="80"/>
+        <w:pBdr>
+          <w:bottom w:val="single" w:sz="6" w:space="1" w:color="00429B"/>
+        </w:pBdr>
+      </w:pPr>
+      <w:r>
+        <w:rPr>
+          <w:rFonts w:ascii="Calibri" w:hAnsi="Calibri"/>
+          <w:b/>
+          <w:color w:val="00429B"/>
+          <w:sz w:val="26"/>
+        </w:rPr>
+        <w:t>8. SMT WATCH LIST</w:t>
+      </w:r>
+    </w:p>
+    <w:p>
+      <w:pPr>
+        <w:spacing w:after="60"/>
+      </w:pPr>
+      <w:r>
+        <w:rPr>
+          <w:rFonts w:ascii="Calibri" w:hAnsi="Calibri"/>
+          <w:sz w:val="21"/>
+        </w:rPr>
+        <w:t>Theme 1: AIFMD II and UCITS Delegation Act Implementation Planning</w:t>
+      </w:r>
+    </w:p>
+    <w:p>
+      <w:pPr>
+        <w:spacing w:after="60"/>
+      </w:pPr>
+      <w:r>
+        <w:rPr>
+          <w:rFonts w:ascii="Calibri" w:hAnsi="Calibri"/>
+          <w:sz w:val="21"/>
+        </w:rPr>
+        <w:t>The delegated acts published in February set a compliance deadline of Q1 2027, requiring changes to fund management company substance, delegation oversight reporting, and liquidity management frameworks across our Luxembourg and Dublin platforms. Recommended action: Convene a cross-functional working group (Legal, Risk, Product, Operations) by end of March to complete a gap analysis against the final delegated act text and produce a remediation roadmap with resource and cost estimates for the April SMT meeting.</w:t>
+      </w:r>
+    </w:p>
+    <w:p>
+      <w:pPr>
+        <w:spacing w:after="60"/>
+      </w:pPr>
+      <w:r>
+        <w:rPr>
+          <w:rFonts w:ascii="Calibri" w:hAnsi="Calibri"/>
+          <w:sz w:val="21"/>
+        </w:rPr>
+        <w:t>Theme 2: Third-Party and Transfer Agent Cyber Resilience</w:t>
+      </w:r>
+    </w:p>
+    <w:p>
+      <w:pPr>
+        <w:spacing w:after="60"/>
+      </w:pPr>
+      <w:r>
+        <w:rPr>
+          <w:rFonts w:ascii="Calibri" w:hAnsi="Calibri"/>
+          <w:sz w:val="21"/>
+        </w:rPr>
+        <w:t>The February ransomware incident exposed vulnerabilities in the broader investor services supply chain and has heightened regulatory scrutiny under DORA and equivalent frameworks. Recommended action: Initiate an accelerated review of critical fourth-party dependencies in our transfer agency and fund accounting value chains, updating business continuity playbooks and confirming contractual audit and notification rights are exercisable and current.</w:t>
+      </w:r>
+    </w:p>
+    <w:p>
+      <w:pPr>
+        <w:spacing w:after="60"/>
+      </w:pPr>
+      <w:r>
+        <w:rPr>
+          <w:rFonts w:ascii="Calibri" w:hAnsi="Calibri"/>
+          <w:sz w:val="21"/>
+        </w:rPr>
+        <w:t>Theme 3: Tokenised Fund Servicing — Strategic Positioning</w:t>
+      </w:r>
+    </w:p>
+    <w:p>
+      <w:pPr>
+        <w:spacing w:after="60"/>
+      </w:pPr>
+      <w:r>
+        <w:rPr>
+          <w:rFonts w:ascii="Calibri" w:hAnsi="Calibri"/>
+          <w:sz w:val="21"/>
+        </w:rPr>
+        <w:t>Momentum behind tokenised money market and fixed income fund issuance is approaching a tipping point, with peers such as BNY actively building on-chain custody and distribution capabilities. Recommended action: Commission a strategic options paper, due by mid-April, assessing client demand signals, infrastructure readiness, regulatory constraints, and partnership opportunities for RBC Investor Services to offer safekeeping and administration services for tokenised fund structures in priority jurisdictions.</w:t>
       </w:r>
     </w:p>
     <w:p/>

</xml_diff>